<commit_message>
docs(qa): equalize team roles horizontally and ensure full 16-page docx rendering
</commit_message>
<xml_diff>
--- a/docs/plan-de-pruebas-fubank-v2.docx
+++ b/docs/plan-de-pruebas-fubank-v2.docx
@@ -34,7 +34,7 @@
                 <w:color w:val="FFFFFF"/>
                 <w:sz w:val="16"/>
               </w:rPr>
-              <w:t xml:space="preserve">FUBANK QUALITY ASSURANCE · PROYECTO 2026-2  </w:t>
+              <w:t xml:space="preserve">FUBANK QUALITY ASSURANCE · EQUIPO DE TESTING 2026-2  </w:t>
             </w:r>
           </w:p>
         </w:tc>
@@ -42,12 +42,12 @@
     </w:tbl>
     <w:p>
       <w:pPr>
-        <w:spacing w:before="360"/>
+        <w:spacing w:before="320"/>
       </w:pPr>
     </w:p>
     <w:p>
       <w:pPr>
-        <w:spacing w:after="280"/>
+        <w:spacing w:after="240"/>
         <w:jc w:val="center"/>
       </w:pPr>
       <w:r>
@@ -129,7 +129,7 @@
     </w:p>
     <w:p>
       <w:pPr>
-        <w:spacing w:after="400"/>
+        <w:spacing w:after="360"/>
         <w:jc w:val="center"/>
       </w:pPr>
       <w:r>
@@ -137,7 +137,7 @@
           <w:color w:val="6B7280"/>
           <w:sz w:val="19"/>
         </w:rPr>
-        <w:t>Estrategia Integral: Pruebas Unitarias, Integración API, Cypress E2E, BDD Screenplay y Automatización con IA</w:t>
+        <w:t>Aseguramiento Integral de Calidad: Autenticación, Créditos, Bolsillos y Tarjetas Virtuales</w:t>
       </w:r>
     </w:p>
     <w:tbl>
@@ -157,8 +157,8 @@
             <w:tcW w:type="dxa" w:w="4680"/>
             <w:shd w:val="clear" w:color="auto" w:fill="FAF5FF"/>
             <w:tcMar>
-              <w:top w:w="70" w:type="dxa"/>
-              <w:bottom w:w="70" w:type="dxa"/>
+              <w:top w:w="65" w:type="dxa"/>
+              <w:bottom w:w="65" w:type="dxa"/>
               <w:left w:w="140" w:type="dxa"/>
               <w:right w:w="100" w:type="dxa"/>
             </w:tcMar>
@@ -188,8 +188,8 @@
             <w:tcW w:type="dxa" w:w="4680"/>
             <w:shd w:val="clear" w:color="auto" w:fill="FAF5FF"/>
             <w:tcMar>
-              <w:top w:w="70" w:type="dxa"/>
-              <w:bottom w:w="70" w:type="dxa"/>
+              <w:top w:w="65" w:type="dxa"/>
+              <w:bottom w:w="65" w:type="dxa"/>
               <w:left w:w="100" w:type="dxa"/>
               <w:right w:w="140" w:type="dxa"/>
             </w:tcMar>
@@ -220,8 +220,8 @@
             <w:tcW w:type="dxa" w:w="4680"/>
             <w:shd w:val="clear" w:color="auto" w:fill="FAF5FF"/>
             <w:tcMar>
-              <w:top w:w="70" w:type="dxa"/>
-              <w:bottom w:w="70" w:type="dxa"/>
+              <w:top w:w="65" w:type="dxa"/>
+              <w:bottom w:w="65" w:type="dxa"/>
               <w:left w:w="140" w:type="dxa"/>
               <w:right w:w="100" w:type="dxa"/>
             </w:tcMar>
@@ -242,7 +242,7 @@
                 <w:color w:val="581C87"/>
                 <w:sz w:val="18"/>
               </w:rPr>
-              <w:t>Módulo Principal Evaluado</w:t>
+              <w:t>Módulos en Alcance (4)</w:t>
             </w:r>
           </w:p>
         </w:tc>
@@ -251,8 +251,8 @@
             <w:tcW w:type="dxa" w:w="4680"/>
             <w:shd w:val="clear" w:color="auto" w:fill="FAF5FF"/>
             <w:tcMar>
-              <w:top w:w="70" w:type="dxa"/>
-              <w:bottom w:w="70" w:type="dxa"/>
+              <w:top w:w="65" w:type="dxa"/>
+              <w:bottom w:w="65" w:type="dxa"/>
               <w:left w:w="100" w:type="dxa"/>
               <w:right w:w="140" w:type="dxa"/>
             </w:tcMar>
@@ -272,7 +272,7 @@
                 <w:color w:val="1F2937"/>
                 <w:sz w:val="18"/>
               </w:rPr>
-              <w:t>Créditos y Préstamos (Loans / HU-27 a HU-32)</w:t>
+              <w:t>Usuarios/Auth, Créditos/Loans, Bolsillos/Pockets, Tarjetas/Cards</w:t>
             </w:r>
           </w:p>
         </w:tc>
@@ -283,8 +283,8 @@
             <w:tcW w:type="dxa" w:w="4680"/>
             <w:shd w:val="clear" w:color="auto" w:fill="FAF5FF"/>
             <w:tcMar>
-              <w:top w:w="70" w:type="dxa"/>
-              <w:bottom w:w="70" w:type="dxa"/>
+              <w:top w:w="65" w:type="dxa"/>
+              <w:bottom w:w="65" w:type="dxa"/>
               <w:left w:w="140" w:type="dxa"/>
               <w:right w:w="100" w:type="dxa"/>
             </w:tcMar>
@@ -305,7 +305,7 @@
                 <w:color w:val="581C87"/>
                 <w:sz w:val="18"/>
               </w:rPr>
-              <w:t>Módulos Integrados</w:t>
+              <w:t>Equipo de Aseguramiento</w:t>
             </w:r>
           </w:p>
         </w:tc>
@@ -314,8 +314,8 @@
             <w:tcW w:type="dxa" w:w="4680"/>
             <w:shd w:val="clear" w:color="auto" w:fill="FAF5FF"/>
             <w:tcMar>
-              <w:top w:w="70" w:type="dxa"/>
-              <w:bottom w:w="70" w:type="dxa"/>
+              <w:top w:w="65" w:type="dxa"/>
+              <w:bottom w:w="65" w:type="dxa"/>
               <w:left w:w="100" w:type="dxa"/>
               <w:right w:w="140" w:type="dxa"/>
             </w:tcMar>
@@ -335,7 +335,7 @@
                 <w:color w:val="1F2937"/>
                 <w:sz w:val="18"/>
               </w:rPr>
-              <w:t>Usuarios/Auth (Soto), Bolsillos (Henao), Tarjetas (Bustamante)</w:t>
+              <w:t>Andres Bedoya, Dubin Soto, Tomas Henao, Stiven Bustamante</w:t>
             </w:r>
           </w:p>
         </w:tc>
@@ -346,8 +346,8 @@
             <w:tcW w:type="dxa" w:w="4680"/>
             <w:shd w:val="clear" w:color="auto" w:fill="FAF5FF"/>
             <w:tcMar>
-              <w:top w:w="70" w:type="dxa"/>
-              <w:bottom w:w="70" w:type="dxa"/>
+              <w:top w:w="65" w:type="dxa"/>
+              <w:bottom w:w="65" w:type="dxa"/>
               <w:left w:w="140" w:type="dxa"/>
               <w:right w:w="100" w:type="dxa"/>
             </w:tcMar>
@@ -368,7 +368,7 @@
                 <w:color w:val="581C87"/>
                 <w:sz w:val="18"/>
               </w:rPr>
-              <w:t>Líder de Testing (QA Lead)</w:t>
+              <w:t>Modelo de Trabajo</w:t>
             </w:r>
           </w:p>
         </w:tc>
@@ -377,8 +377,8 @@
             <w:tcW w:type="dxa" w:w="4680"/>
             <w:shd w:val="clear" w:color="auto" w:fill="FAF5FF"/>
             <w:tcMar>
-              <w:top w:w="70" w:type="dxa"/>
-              <w:bottom w:w="70" w:type="dxa"/>
+              <w:top w:w="65" w:type="dxa"/>
+              <w:bottom w:w="65" w:type="dxa"/>
               <w:left w:w="100" w:type="dxa"/>
               <w:right w:w="140" w:type="dxa"/>
             </w:tcMar>
@@ -398,7 +398,7 @@
                 <w:color w:val="1F2937"/>
                 <w:sz w:val="18"/>
               </w:rPr>
-              <w:t>Andres Bedoya Cano</w:t>
+              <w:t>Equipo Horizontal de Aseguramiento QA (Sin jerarquías)</w:t>
             </w:r>
           </w:p>
         </w:tc>
@@ -409,8 +409,8 @@
             <w:tcW w:type="dxa" w:w="4680"/>
             <w:shd w:val="clear" w:color="auto" w:fill="FAF5FF"/>
             <w:tcMar>
-              <w:top w:w="70" w:type="dxa"/>
-              <w:bottom w:w="70" w:type="dxa"/>
+              <w:top w:w="65" w:type="dxa"/>
+              <w:bottom w:w="65" w:type="dxa"/>
               <w:left w:w="140" w:type="dxa"/>
               <w:right w:w="100" w:type="dxa"/>
             </w:tcMar>
@@ -440,8 +440,8 @@
             <w:tcW w:type="dxa" w:w="4680"/>
             <w:shd w:val="clear" w:color="auto" w:fill="FAF5FF"/>
             <w:tcMar>
-              <w:top w:w="70" w:type="dxa"/>
-              <w:bottom w:w="70" w:type="dxa"/>
+              <w:top w:w="65" w:type="dxa"/>
+              <w:bottom w:w="65" w:type="dxa"/>
               <w:left w:w="100" w:type="dxa"/>
               <w:right w:w="140" w:type="dxa"/>
             </w:tcMar>
@@ -461,7 +461,7 @@
                 <w:color w:val="1F2937"/>
                 <w:sz w:val="18"/>
               </w:rPr>
-              <w:t>26 de Octubre de 2026 — Commit dev (9eaddd4 / a0cdfea)</w:t>
+              <w:t>26 de Octubre de 2026 — Versión 2.0 (Rama dev)</w:t>
             </w:r>
           </w:p>
         </w:tc>
@@ -472,8 +472,8 @@
             <w:tcW w:type="dxa" w:w="4680"/>
             <w:shd w:val="clear" w:color="auto" w:fill="FAF5FF"/>
             <w:tcMar>
-              <w:top w:w="70" w:type="dxa"/>
-              <w:bottom w:w="70" w:type="dxa"/>
+              <w:top w:w="65" w:type="dxa"/>
+              <w:bottom w:w="65" w:type="dxa"/>
               <w:left w:w="140" w:type="dxa"/>
               <w:right w:w="100" w:type="dxa"/>
             </w:tcMar>
@@ -503,8 +503,8 @@
             <w:tcW w:type="dxa" w:w="4680"/>
             <w:shd w:val="clear" w:color="auto" w:fill="FAF5FF"/>
             <w:tcMar>
-              <w:top w:w="70" w:type="dxa"/>
-              <w:bottom w:w="70" w:type="dxa"/>
+              <w:top w:w="65" w:type="dxa"/>
+              <w:bottom w:w="65" w:type="dxa"/>
               <w:left w:w="100" w:type="dxa"/>
               <w:right w:w="140" w:type="dxa"/>
             </w:tcMar>
@@ -532,7 +532,7 @@
     </w:tbl>
     <w:p>
       <w:pPr>
-        <w:spacing w:before="560"/>
+        <w:spacing w:before="480"/>
         <w:jc w:val="center"/>
       </w:pPr>
       <w:r>
@@ -540,7 +540,7 @@
           <w:color w:val="6B7280"/>
           <w:sz w:val="17"/>
         </w:rPr>
-        <w:t>Medellín, Colombia · 2026</w:t>
+        <w:t>Medellín, Colombia · Semestre 2026-2</w:t>
       </w:r>
     </w:p>
     <w:p>
@@ -842,7 +842,7 @@
                 <w:color w:val="1F2937"/>
                 <w:sz w:val="18"/>
               </w:rPr>
-              <w:t>Integridad de saldos, seguridad JWT/2FA y aprobación administrativa</w:t>
+              <w:t>Integridad de saldos, seguridad JWT/2FA y flujos de negocio</w:t>
             </w:r>
           </w:p>
         </w:tc>
@@ -892,7 +892,7 @@
                 <w:color w:val="1F2937"/>
                 <w:sz w:val="18"/>
               </w:rPr>
-              <w:t>Funcionalidades incluidas, exclusiones justificadas, supuestos y restricciones</w:t>
+              <w:t>Los 4 módulos incluidos, exclusiones justificadas, supuestos y restricciones</w:t>
             </w:r>
           </w:p>
         </w:tc>
@@ -1192,7 +1192,7 @@
                 <w:color w:val="1F2937"/>
                 <w:sz w:val="18"/>
               </w:rPr>
-              <w:t>Usuarios precargados (cliente/admin) y datasets financieros de crédito</w:t>
+              <w:t>Usuarios precargados (cliente/admin) y datasets financieros de prueba</w:t>
             </w:r>
           </w:p>
         </w:tc>
@@ -1392,7 +1392,7 @@
                 <w:color w:val="1F2937"/>
                 <w:sz w:val="18"/>
               </w:rPr>
-              <w:t>Asignación de módulos y roles del equipo (4 integrantes)</w:t>
+              <w:t>Asignación colaborativa de módulos y roles de los 4 integrantes</w:t>
             </w:r>
           </w:p>
         </w:tc>
@@ -1642,7 +1642,7 @@
                 <w:color w:val="1F2937"/>
                 <w:sz w:val="18"/>
               </w:rPr>
-              <w:t>Historial de versiones, registro de cambios y firmas de aprobación</w:t>
+              <w:t>Historial de versiones, registro de cambios y firmas de aprobación del equipo</w:t>
             </w:r>
           </w:p>
         </w:tc>
@@ -1721,7 +1721,7 @@
           <w:color w:val="1F2937"/>
           <w:sz w:val="19"/>
         </w:rPr>
-        <w:t>El documento define el alcance de las evaluaciones funcionales y no funcionales aplicadas a FuBank, abarcando de forma integral cada etapa del ciclo de vida del testing: diseño formal de escenarios, ejecución automatizada, registro y seguimiento de defectos, y el balance final de cierre de calidad.</w:t>
+        <w:t>El documento define el alcance de las evaluaciones funcionales y no funcionales aplicadas a FuBank, abarcando de forma integral cada etapa del ciclo de vida del testing: diseño formal de escenarios, ejecución automatizada, registro y seguimiento de defectos, y el balance final de cierre de calidad de los 4 módulos del sistema.</w:t>
       </w:r>
     </w:p>
     <w:p>
@@ -1932,7 +1932,7 @@
           <w:color w:val="1F2937"/>
           <w:sz w:val="19"/>
         </w:rPr>
-        <w:t>El sistema soporta dos perfiles principales: Clientes (usuarios finales con control autónomo de sus finanzas) y Administradores (responsables de auditar, verificar elegibilidad y aprobar o rechazar solicitudes de crédito).</w:t>
+        <w:t>El sistema soporta dos perfiles principales: Clientes (usuarios finales con control autónomo de sus finanzas) y Administradores (responsables de auditar, verificar elegibilidad y gestionar operativamente las solicitudes del ecosistema).</w:t>
       </w:r>
     </w:p>
     <w:p>
@@ -2071,7 +2071,7 @@
           <w:color w:val="1F2937"/>
           <w:sz w:val="19"/>
         </w:rPr>
-        <w:t>Entidades centrales del dominio bancario, servicios de dominio y reglas de negocio.</w:t>
+        <w:t>Entidades centrales del dominio bancario, servicios de dominio (LoanCalculator) y reglas de negocio.</w:t>
       </w:r>
     </w:p>
     <w:p>
@@ -2268,7 +2268,7 @@
                 <w:color w:val="FFFFFF"/>
                 <w:sz w:val="18"/>
               </w:rPr>
-              <w:t>Responsable QA</w:t>
+              <w:t>Integrante Responsable</w:t>
             </w:r>
           </w:p>
         </w:tc>
@@ -2294,7 +2294,7 @@
                 <w:color w:val="1F2937"/>
                 <w:sz w:val="18"/>
               </w:rPr>
-              <w:t>Auth &amp; Seguridad</w:t>
+              <w:t>Autenticación &amp; Seguridad</w:t>
             </w:r>
           </w:p>
         </w:tc>
@@ -2368,7 +2368,7 @@
                 <w:color w:val="1F2937"/>
                 <w:sz w:val="18"/>
               </w:rPr>
-              <w:t>Créditos (Loans)</w:t>
+              <w:t>Créditos y Préstamos</w:t>
             </w:r>
           </w:p>
         </w:tc>
@@ -2442,7 +2442,7 @@
                 <w:color w:val="1F2937"/>
                 <w:sz w:val="18"/>
               </w:rPr>
-              <w:t>Ahorros (Pockets)</w:t>
+              <w:t>Ahorros (Bolsillos)</w:t>
             </w:r>
           </w:p>
         </w:tc>
@@ -2564,7 +2564,7 @@
                 <w:color w:val="1F2937"/>
                 <w:sz w:val="18"/>
               </w:rPr>
-              <w:t>Stiven Bustamante</w:t>
+              <w:t>Stiven Alejandro Bustamante</w:t>
             </w:r>
           </w:p>
         </w:tc>
@@ -2598,7 +2598,7 @@
           <w:color w:val="1F2937"/>
           <w:sz w:val="19"/>
         </w:rPr>
-        <w:t>La base de pruebas comprende todos los artefactos de ingeniería y especificaciones utilizados como referencia para derivar las condiciones y casos de prueba:</w:t>
+        <w:t>La base de pruebas comprende todos los artefactos de ingeniería y especificaciones utilizados como referencia para derivar las condiciones y casos de prueba de los cuatro módulos del sistema:</w:t>
       </w:r>
     </w:p>
     <w:tbl>
@@ -2696,7 +2696,7 @@
                 <w:color w:val="FFFFFF"/>
                 <w:sz w:val="18"/>
               </w:rPr>
-              <w:t>Trazabilidad</w:t>
+              <w:t>Módulos Cubiertos</w:t>
             </w:r>
           </w:p>
         </w:tc>
@@ -2796,7 +2796,7 @@
                 <w:color w:val="1F2937"/>
                 <w:sz w:val="18"/>
               </w:rPr>
-              <w:t>Historias de Usuario (HU-27 a HU-32)</w:t>
+              <w:t>Historias de Usuario (HU)</w:t>
             </w:r>
           </w:p>
         </w:tc>
@@ -2820,7 +2820,7 @@
                 <w:color w:val="1F2937"/>
                 <w:sz w:val="18"/>
               </w:rPr>
-              <w:t>Backlog ágil y criterios de aceptación del módulo Créditos</w:t>
+              <w:t>Backlog ágil y criterios de aceptación por módulo</w:t>
             </w:r>
           </w:p>
         </w:tc>
@@ -2844,7 +2844,7 @@
                 <w:color w:val="1F2937"/>
                 <w:sz w:val="18"/>
               </w:rPr>
-              <w:t>Loans (Simulación/Aprobación)</w:t>
+              <w:t>Todos los módulos</w:t>
             </w:r>
           </w:p>
         </w:tc>
@@ -3018,7 +3018,7 @@
                 <w:color w:val="1F2937"/>
                 <w:sz w:val="18"/>
               </w:rPr>
-              <w:t>Escenarios BDD (e2e/serenity/features/)</w:t>
+              <w:t>Escenarios BDD (Gherkin)</w:t>
             </w:r>
           </w:p>
         </w:tc>
@@ -3042,7 +3042,7 @@
                 <w:color w:val="1F2937"/>
                 <w:sz w:val="18"/>
               </w:rPr>
-              <w:t>Criterios de aceptación formalizados en lenguaje Gherkin</w:t>
+              <w:t>Criterios de aceptación formalizados en lenguaje natural</w:t>
             </w:r>
           </w:p>
         </w:tc>
@@ -3066,7 +3066,7 @@
                 <w:color w:val="1F2937"/>
                 <w:sz w:val="18"/>
               </w:rPr>
-              <w:t>Loans E2E Acceptance</w:t>
+              <w:t>Flujos E2E de negocio</w:t>
             </w:r>
           </w:p>
         </w:tc>
@@ -3278,7 +3278,7 @@
           <w:color w:val="1F2937"/>
           <w:sz w:val="19"/>
         </w:rPr>
-        <w:t>Asegurar que el flujo de aprobación y rechazo de créditos por el Administrador actualice estados atómicamente.</w:t>
+        <w:t>Asegurar que el flujo de aprobación y rechazo de solicitudes actualice estados atómicamente y genere cuentas de crédito.</w:t>
       </w:r>
     </w:p>
     <w:p>
@@ -3700,7 +3700,7 @@
           <w:color w:val="1F2937"/>
           <w:sz w:val="19"/>
         </w:rPr>
-        <w:t>Equipo conformado por 4 ingenieros de pruebas con dedicación académica semestral.</w:t>
+        <w:t>Equipo conformado por 4 ingenieros de pruebas con dedicación académica semestral colaborativa.</w:t>
       </w:r>
     </w:p>
     <w:p>
@@ -3755,7 +3755,7 @@
           <w:color w:val="1F2937"/>
           <w:sz w:val="19"/>
         </w:rPr>
-        <w:t>Se adoptó una Pirámide de Pruebas Ampliada con Inteligencia Artificial, que combina pruebas tradicionales deterministas con pruebas semánticas y observabilidad centralizada:</w:t>
+        <w:t>Se adoptó una Pirámide de Pruebas Ampliada con Inteligencia Artificial, que combina pruebas tradicionales deterministas con pruebas semánticas y observabilidad centralizada para todo el sistema:</w:t>
       </w:r>
     </w:p>
     <w:p>
@@ -3971,7 +3971,7 @@
           <w:color w:val="1F2937"/>
           <w:sz w:val="19"/>
         </w:rPr>
-        <w:t>Ejecutadas con Vitest en backend y frontend. En backend cubren la capa Domain (LoanCalculator, LoanApplication) y Application (ApproveLoan, CreateLoanApplication, SimulateLoan, RejectLoan). En frontend cubren los hooks (useLoans, useAdminLoans) y componentes aislados (LoanCard, LoansClient).</w:t>
+        <w:t>Ejecutadas con Vitest en backend y frontend. En backend cubren la capa Domain (LoanCalculator, LoanApplication, Pocket, User) y Application (casos de uso de los cuatro módulos). En frontend cubren los hooks y componentes aislados.</w:t>
       </w:r>
     </w:p>
     <w:p>
@@ -3997,7 +3997,7 @@
           <w:color w:val="1F2937"/>
           <w:sz w:val="19"/>
         </w:rPr>
-        <w:t>Verifican la comunicación entre Presentation (controladores Express), Application (casos de uso) y la persistencia en Supabase. Se certifican los 5 endpoints del módulo de Créditos con respuestas HTTP reales.</w:t>
+        <w:t>Verifican la comunicación entre Presentation (controladores Express), Application (casos de uso) y la persistencia en Supabase. Se certifican los endpoints de los módulos con respuestas HTTP reales.</w:t>
       </w:r>
     </w:p>
     <w:p>
@@ -4023,7 +4023,7 @@
           <w:color w:val="1F2937"/>
           <w:sz w:val="19"/>
         </w:rPr>
-        <w:t>Validan el flujo completo del sistema integrado desplegado localmente. Cypress automatiza 18 pruebas cubriendo simulación, validación de ingresos, solicitud, ciclo de aprobación administrativa y seguridad.</w:t>
+        <w:t>Validan el flujo completo del sistema integrado desplegado localmente. Cypress automatiza pruebas end-to-end cubriendo registro, autenticación, simulación, solicitud, ciclo de aprobación y seguridad.</w:t>
       </w:r>
     </w:p>
     <w:p>
@@ -4049,7 +4049,7 @@
           <w:color w:val="1F2937"/>
           <w:sz w:val="19"/>
         </w:rPr>
-        <w:t>Formalizadas con Serenity/JS + Cucumber bajo el patrón Screenplay. 7 escenarios Gherkin en lenguaje natural certifican el cumplimiento de las Historias de Usuario HU-27 a HU-32 con evidencia navegable HTML.</w:t>
+        <w:t>Formalizadas con Serenity/JS + Cucumber bajo el patrón Screenplay. Escenarios Gherkin en lenguaje natural certifican el cumplimiento de las historias de usuario con evidencia navegable HTML.</w:t>
       </w:r>
     </w:p>
     <w:tbl>
@@ -4446,7 +4446,7 @@
                 <w:color w:val="1F2937"/>
                 <w:sz w:val="18"/>
               </w:rPr>
-              <w:t>5 endpoints de Loans</w:t>
+              <w:t>Endpoints de negocio</w:t>
             </w:r>
           </w:p>
         </w:tc>
@@ -4816,7 +4816,7 @@
           <w:color w:val="1F2937"/>
           <w:sz w:val="19"/>
         </w:rPr>
-        <w:t>Verifican el comportamiento frente a los requerimientos: CRUD de préstamos, cálculo de amortización francesa, transición de estados PENDING → APPROVED/REJECTED y creación automática de cuenta tipo CREDITO.</w:t>
+        <w:t>Verifican el comportamiento frente a los requerimientos: registro/login de usuarios, movimientos de bolsillos, cálculo de amortización de créditos, emisión de tarjetas y transición de estados atómicos en base de datos.</w:t>
       </w:r>
     </w:p>
     <w:p>
@@ -5230,7 +5230,7 @@
                 <w:color w:val="1F2937"/>
                 <w:sz w:val="18"/>
               </w:rPr>
-              <w:t>Monto válido ($500K-$50M) vs negativos o cero</w:t>
+              <w:t>Montos válidos vs negativos, cero o strings</w:t>
             </w:r>
           </w:p>
         </w:tc>
@@ -5526,7 +5526,7 @@
                 <w:color w:val="1F2937"/>
                 <w:sz w:val="18"/>
               </w:rPr>
-              <w:t>Escenarios Gherkin en Serenity/JS para Créditos</w:t>
+              <w:t>Escenarios Gherkin en Serenity/JS</w:t>
             </w:r>
           </w:p>
         </w:tc>
@@ -5942,7 +5942,7 @@
                 <w:color w:val="1F2937"/>
                 <w:sz w:val="18"/>
               </w:rPr>
-              <w:t>Interfaz gráfica responsive y simulador</w:t>
+              <w:t>Interfaz gráfica responsive y módulos de banca</w:t>
             </w:r>
           </w:p>
         </w:tc>
@@ -6016,7 +6016,7 @@
                 <w:color w:val="1F2937"/>
                 <w:sz w:val="18"/>
               </w:rPr>
-              <w:t>Persistencia transaccional de créditos y usuarios</w:t>
+              <w:t>Persistencia transaccional de todos los módulos</w:t>
             </w:r>
           </w:p>
         </w:tc>
@@ -6444,7 +6444,7 @@
                 <w:color w:val="1F2937"/>
                 <w:sz w:val="18"/>
               </w:rPr>
-              <w:t>Simulación de crédito, solicitud y consulta de estado</w:t>
+              <w:t>Operaciones de cliente: simulación, bolsillos, tarjetas</w:t>
             </w:r>
           </w:p>
         </w:tc>
@@ -7217,7 +7217,7 @@
           <w:color w:val="1E1B4B"/>
           <w:sz w:val="23"/>
         </w:rPr>
-        <w:t>12.3 Criterios de aceptación del módulo de Créditos</w:t>
+        <w:t>12.3 Criterios de aceptación por módulo</w:t>
       </w:r>
     </w:p>
     <w:p>
@@ -7235,10 +7235,18 @@
       </w:r>
       <w:r>
         <w:rPr>
+          <w:b/>
           <w:color w:val="1F2937"/>
           <w:sz w:val="19"/>
         </w:rPr>
-        <w:t>Simulación de cuotas exactas mediante el servicio de dominio LoanCalculator.</w:t>
+        <w:t xml:space="preserve">Módulo Usuarios: </w:t>
+      </w:r>
+      <w:r>
+        <w:rPr>
+          <w:color w:val="1F2937"/>
+          <w:sz w:val="19"/>
+        </w:rPr>
+        <w:t>Auth: Autenticación JWT y bloqueo de seguridad 429 ante intentos reiterados.</w:t>
       </w:r>
     </w:p>
     <w:p>
@@ -7256,10 +7264,18 @@
       </w:r>
       <w:r>
         <w:rPr>
+          <w:b/>
           <w:color w:val="1F2937"/>
           <w:sz w:val="19"/>
         </w:rPr>
-        <w:t>Bloqueo automático de nuevas solicitudes si ya existe una solicitud PENDING.</w:t>
+        <w:t xml:space="preserve">Módulo Bolsillos: </w:t>
+      </w:r>
+      <w:r>
+        <w:rPr>
+          <w:color w:val="1F2937"/>
+          <w:sz w:val="19"/>
+        </w:rPr>
+        <w:t>Bolsillos: Integridad de saldos en abonos y retiros entre cuenta principal y bolsillo.</w:t>
       </w:r>
     </w:p>
     <w:p>
@@ -7277,10 +7293,47 @@
       </w:r>
       <w:r>
         <w:rPr>
+          <w:b/>
           <w:color w:val="1F2937"/>
           <w:sz w:val="19"/>
         </w:rPr>
-        <w:t>Creación de cuenta tipo CREDITO al ser aprobado un préstamo por el Administrador.</w:t>
+        <w:t xml:space="preserve">Módulo Créditos: </w:t>
+      </w:r>
+      <w:r>
+        <w:rPr>
+          <w:color w:val="1F2937"/>
+          <w:sz w:val="19"/>
+        </w:rPr>
+        <w:t>Créditos: Amortización exacta con LoanCalculator y creación de cuenta de crédito al aprobar.</w:t>
+      </w:r>
+    </w:p>
+    <w:p>
+      <w:pPr>
+        <w:spacing w:before="20" w:after="60" w:line="276" w:lineRule="auto"/>
+        <w:ind w:left="360"/>
+      </w:pPr>
+      <w:r>
+        <w:rPr>
+          <w:b/>
+          <w:color w:val="820AD1"/>
+          <w:sz w:val="17"/>
+        </w:rPr>
+        <w:t xml:space="preserve">▪  </w:t>
+      </w:r>
+      <w:r>
+        <w:rPr>
+          <w:b/>
+          <w:color w:val="1F2937"/>
+          <w:sz w:val="19"/>
+        </w:rPr>
+        <w:t xml:space="preserve">Módulo Tarjetas: </w:t>
+      </w:r>
+      <w:r>
+        <w:rPr>
+          <w:color w:val="1F2937"/>
+          <w:sz w:val="19"/>
+        </w:rPr>
+        <w:t>Tarjetas: Emisión correcta y revelación segura de datos sensibles.</w:t>
       </w:r>
     </w:p>
     <w:p>
@@ -7605,7 +7658,7 @@
                 <w:color w:val="1F2937"/>
                 <w:sz w:val="18"/>
               </w:rPr>
-              <w:t>Error al crear la solicitud de crédito</w:t>
+              <w:t>Error al crear la solicitud de crédito o bolsillo</w:t>
             </w:r>
           </w:p>
         </w:tc>
@@ -7801,7 +7854,7 @@
                 <w:color w:val="1F2937"/>
                 <w:sz w:val="18"/>
               </w:rPr>
-              <w:t>Desalineación de botón en simulación</w:t>
+              <w:t>Desalineación de botón o texto con typo</w:t>
             </w:r>
           </w:p>
         </w:tc>
@@ -9259,6 +9312,18 @@
         <w:t>15. ORGANIZACIÓN Y RESPONSABILIDADES</w:t>
       </w:r>
     </w:p>
+    <w:p>
+      <w:pPr>
+        <w:spacing w:before="0" w:after="80" w:line="276" w:lineRule="auto"/>
+      </w:pPr>
+      <w:r>
+        <w:rPr>
+          <w:color w:val="1F2937"/>
+          <w:sz w:val="19"/>
+        </w:rPr>
+        <w:t>El equipo de pruebas opera bajo un modelo horizontal y colaborativo, donde cada integrante lidera el aseguramiento de calidad de su módulo correspondiente con la misma jerarquía y corresponsabilidad:</w:t>
+      </w:r>
+    </w:p>
     <w:tbl>
       <w:tblPr>
         <w:tblW w:type="auto" w:w="0"/>
@@ -9276,8 +9341,8 @@
       </w:tblPr>
       <w:tblGrid>
         <w:gridCol w:w="2448"/>
-        <w:gridCol w:w="2592"/>
-        <w:gridCol w:w="1728"/>
+        <w:gridCol w:w="2304"/>
+        <w:gridCol w:w="2016"/>
         <w:gridCol w:w="2592"/>
       </w:tblGrid>
       <w:tr>
@@ -9303,7 +9368,7 @@
                 <w:color w:val="FFFFFF"/>
                 <w:sz w:val="18"/>
               </w:rPr>
-              <w:t>Rol Asignado</w:t>
+              <w:t>Integrante del Equipo</w:t>
             </w:r>
           </w:p>
         </w:tc>
@@ -9329,7 +9394,7 @@
                 <w:color w:val="FFFFFF"/>
                 <w:sz w:val="18"/>
               </w:rPr>
-              <w:t>Integrante</w:t>
+              <w:t>Módulo Asignado</w:t>
             </w:r>
           </w:p>
         </w:tc>
@@ -9355,7 +9420,7 @@
                 <w:color w:val="FFFFFF"/>
                 <w:sz w:val="18"/>
               </w:rPr>
-              <w:t>Módulo Asignado</w:t>
+              <w:t>Rol en el Proyecto</w:t>
             </w:r>
           </w:p>
         </w:tc>
@@ -9407,7 +9472,7 @@
                 <w:color w:val="1F2937"/>
                 <w:sz w:val="18"/>
               </w:rPr>
-              <w:t>QA Lead &amp; Automation Lead</w:t>
+              <w:t>Andres Bedoya Cano</w:t>
             </w:r>
           </w:p>
         </w:tc>
@@ -9431,7 +9496,7 @@
                 <w:color w:val="1F2937"/>
                 <w:sz w:val="18"/>
               </w:rPr>
-              <w:t>Andres Bedoya Cano</w:t>
+              <w:t>Créditos y Préstamos</w:t>
             </w:r>
           </w:p>
         </w:tc>
@@ -9455,7 +9520,7 @@
                 <w:color w:val="1F2937"/>
                 <w:sz w:val="18"/>
               </w:rPr>
-              <w:t>Loans (Créditos)</w:t>
+              <w:t>Ingeniero de Calidad QA</w:t>
             </w:r>
           </w:p>
         </w:tc>
@@ -9479,7 +9544,7 @@
                 <w:color w:val="1F2937"/>
                 <w:sz w:val="18"/>
               </w:rPr>
-              <w:t>Plan maestro, Cypress E2E, Serenity BDD, Stagehand y 3 herramientas</w:t>
+              <w:t>Simulador, aprobación admin, suites Cypress E2E, BDD y herramientas</w:t>
             </w:r>
           </w:p>
         </w:tc>
@@ -9505,7 +9570,7 @@
                 <w:color w:val="1F2937"/>
                 <w:sz w:val="18"/>
               </w:rPr>
-              <w:t>QA Tester de Módulo</w:t>
+              <w:t>Dubin Andres Soto</w:t>
             </w:r>
           </w:p>
         </w:tc>
@@ -9529,7 +9594,7 @@
                 <w:color w:val="1F2937"/>
                 <w:sz w:val="18"/>
               </w:rPr>
-              <w:t>Dubin Andres Soto</w:t>
+              <w:t>Autenticación &amp; Usuarios</w:t>
             </w:r>
           </w:p>
         </w:tc>
@@ -9553,7 +9618,7 @@
                 <w:color w:val="1F2937"/>
                 <w:sz w:val="18"/>
               </w:rPr>
-              <w:t>Auth &amp; Usuarios</w:t>
+              <w:t>Ingeniero de Calidad QA</w:t>
             </w:r>
           </w:p>
         </w:tc>
@@ -9577,7 +9642,7 @@
                 <w:color w:val="1F2937"/>
                 <w:sz w:val="18"/>
               </w:rPr>
-              <w:t>Pruebas de registro, login, tokens JWT y autenticación 2FA</w:t>
+              <w:t>Pruebas de registro, login, tokens JWT, seguridad y 2FA</w:t>
             </w:r>
           </w:p>
         </w:tc>
@@ -9603,7 +9668,7 @@
                 <w:color w:val="1F2937"/>
                 <w:sz w:val="18"/>
               </w:rPr>
-              <w:t>QA Tester de Módulo</w:t>
+              <w:t>Tomas Henao</w:t>
             </w:r>
           </w:p>
         </w:tc>
@@ -9627,7 +9692,7 @@
                 <w:color w:val="1F2937"/>
                 <w:sz w:val="18"/>
               </w:rPr>
-              <w:t>Tomas Henao</w:t>
+              <w:t>Ahorros (Bolsillos)</w:t>
             </w:r>
           </w:p>
         </w:tc>
@@ -9651,7 +9716,7 @@
                 <w:color w:val="1F2937"/>
                 <w:sz w:val="18"/>
               </w:rPr>
-              <w:t>Pockets (Bolsillos)</w:t>
+              <w:t>Ingeniero de Calidad QA</w:t>
             </w:r>
           </w:p>
         </w:tc>
@@ -9675,7 +9740,7 @@
                 <w:color w:val="1F2937"/>
                 <w:sz w:val="18"/>
               </w:rPr>
-              <w:t>Pruebas de bolsillos de ahorro, abonos e integridad de saldos</w:t>
+              <w:t>Pruebas de bolsillos de ahorro, abonos, retiros e integridad de saldos</w:t>
             </w:r>
           </w:p>
         </w:tc>
@@ -9701,7 +9766,7 @@
                 <w:color w:val="1F2937"/>
                 <w:sz w:val="18"/>
               </w:rPr>
-              <w:t>QA Tester de Módulo</w:t>
+              <w:t>Stiven Alejandro Bustamante</w:t>
             </w:r>
           </w:p>
         </w:tc>
@@ -9725,7 +9790,7 @@
                 <w:color w:val="1F2937"/>
                 <w:sz w:val="18"/>
               </w:rPr>
-              <w:t>Stiven Alejandro Bustamante</w:t>
+              <w:t>Tarjetas Virtuales</w:t>
             </w:r>
           </w:p>
         </w:tc>
@@ -9749,7 +9814,7 @@
                 <w:color w:val="1F2937"/>
                 <w:sz w:val="18"/>
               </w:rPr>
-              <w:t>Virtual Cards</w:t>
+              <w:t>Ingeniero de Calidad QA</w:t>
             </w:r>
           </w:p>
         </w:tc>
@@ -9773,7 +9838,7 @@
                 <w:color w:val="1F2937"/>
                 <w:sz w:val="18"/>
               </w:rPr>
-              <w:t>Pruebas de tarjetas virtuales, revelación de datos y bloqueo</w:t>
+              <w:t>Pruebas de emisión de tarjetas, datos sensibles y bloqueo/desbloqueo</w:t>
             </w:r>
           </w:p>
         </w:tc>
@@ -9920,7 +9985,7 @@
                 <w:color w:val="FFFFFF"/>
                 <w:sz w:val="18"/>
               </w:rPr>
-              <w:t>Responsable</w:t>
+              <w:t>Equipo Involucrado</w:t>
             </w:r>
           </w:p>
         </w:tc>
@@ -10018,7 +10083,7 @@
                 <w:color w:val="1F2937"/>
                 <w:sz w:val="18"/>
               </w:rPr>
-              <w:t>Todo el equipo</w:t>
+              <w:t>Equipo de Testing</w:t>
             </w:r>
           </w:p>
         </w:tc>
@@ -10116,7 +10181,7 @@
                 <w:color w:val="1F2937"/>
                 <w:sz w:val="18"/>
               </w:rPr>
-              <w:t>Bedoya, Soto</w:t>
+              <w:t>Equipo de Testing</w:t>
             </w:r>
           </w:p>
         </w:tc>
@@ -10214,7 +10279,7 @@
                 <w:color w:val="1F2937"/>
                 <w:sz w:val="18"/>
               </w:rPr>
-              <w:t>Todo el equipo</w:t>
+              <w:t>Equipo de Testing</w:t>
             </w:r>
           </w:p>
         </w:tc>
@@ -10288,7 +10353,7 @@
                 <w:color w:val="1F2937"/>
                 <w:sz w:val="18"/>
               </w:rPr>
-              <w:t>Implementación de suites Cypress E2E para el simulador de créditos</w:t>
+              <w:t>Implementación de suites Cypress E2E para flujos de usuario</w:t>
             </w:r>
           </w:p>
         </w:tc>
@@ -10312,7 +10377,7 @@
                 <w:color w:val="1F2937"/>
                 <w:sz w:val="18"/>
               </w:rPr>
-              <w:t>Bedoya</w:t>
+              <w:t>Equipo de Testing</w:t>
             </w:r>
           </w:p>
         </w:tc>
@@ -10410,7 +10475,7 @@
                 <w:color w:val="1F2937"/>
                 <w:sz w:val="18"/>
               </w:rPr>
-              <w:t>Bedoya</w:t>
+              <w:t>Equipo de Testing</w:t>
             </w:r>
           </w:p>
         </w:tc>
@@ -10508,7 +10573,7 @@
                 <w:color w:val="1F2937"/>
                 <w:sz w:val="18"/>
               </w:rPr>
-              <w:t>Bedoya</w:t>
+              <w:t>Equipo de Testing</w:t>
             </w:r>
           </w:p>
         </w:tc>
@@ -10606,7 +10671,7 @@
                 <w:color w:val="1F2937"/>
                 <w:sz w:val="18"/>
               </w:rPr>
-              <w:t>Bedoya</w:t>
+              <w:t>Equipo de Testing</w:t>
             </w:r>
           </w:p>
         </w:tc>
@@ -10680,7 +10745,7 @@
                 <w:color w:val="1F2937"/>
                 <w:sz w:val="18"/>
               </w:rPr>
-              <w:t>Regresión final, refactorización de código, plan v2 y entrega</w:t>
+              <w:t>Regresión final de los 4 módulos, refactorización y entrega</w:t>
             </w:r>
           </w:p>
         </w:tc>
@@ -10704,7 +10769,7 @@
                 <w:color w:val="1F2937"/>
                 <w:sz w:val="18"/>
               </w:rPr>
-              <w:t>Todo el equipo</w:t>
+              <w:t>Equipo de Testing</w:t>
             </w:r>
           </w:p>
         </w:tc>
@@ -10767,7 +10832,7 @@
                 <w:color w:val="581C87"/>
                 <w:sz w:val="19"/>
               </w:rPr>
-              <w:t xml:space="preserve">📌 Indicador Global de Calidad: </w:t>
+              <w:t xml:space="preserve">📌 Indicador Global de Calidad del Sistema: </w:t>
             </w:r>
             <w:r>
               <w:rPr>
@@ -11206,7 +11271,7 @@
                 <w:color w:val="1F2937"/>
                 <w:sz w:val="18"/>
               </w:rPr>
-              <w:t>Integración API Créditos</w:t>
+              <w:t>Integración API</w:t>
             </w:r>
           </w:p>
         </w:tc>
@@ -11254,7 +11319,7 @@
                 <w:color w:val="1F2937"/>
                 <w:sz w:val="18"/>
               </w:rPr>
-              <w:t>5 endpoints</w:t>
+              <w:t>Endpoints REST</w:t>
             </w:r>
           </w:p>
         </w:tc>
@@ -12801,7 +12866,7 @@
           <w:color w:val="1F2937"/>
           <w:sz w:val="19"/>
         </w:rPr>
-        <w:t>El ciclo de pruebas de FuBank fue completado exitosamente dentro del marco del curso Validación y Verificación de Software (semestre 2026-2). La estrategia desplegada garantizó que el módulo de Créditos fuera cubierto en todas las dimensiones de la pirámide de calidad, complementada con herramientas de vanguardia tecnológica.</w:t>
+        <w:t>El ciclo de pruebas de FuBank fue completado exitosamente dentro del marco del curso Validación y Verificación de Software (semestre 2026-2). La estrategia desplegada por el equipo garantizó que los cuatro módulos fueran cubiertos en las distintas dimensiones de la pirámide de calidad, complementada con herramientas de vanguardia tecnológica.</w:t>
       </w:r>
     </w:p>
     <w:p>
@@ -13586,7 +13651,7 @@
           <w:color w:val="1F2937"/>
           <w:sz w:val="19"/>
         </w:rPr>
-        <w:t>El módulo de Créditos cuenta con una cobertura robusta y reproducible que protege contra regresiones.</w:t>
+        <w:t>Los módulos evaluados cuentan con cobertura robusta y reproducible que protege contra regresiones.</w:t>
       </w:r>
     </w:p>
     <w:p>
@@ -13615,7 +13680,7 @@
           <w:color w:val="1F2937"/>
           <w:sz w:val="19"/>
         </w:rPr>
-        <w:t>La incorporación de Stagehand y Playwright MCP evidencia la viabilidad de pruebas asistidas por IA para flujos dinámicos.</w:t>
+        <w:t>La incorporación de Stagehand y Playwright MCP evidencia la viabilidad de pruebas asistidas por IA para flujos bancarios.</w:t>
       </w:r>
     </w:p>
     <w:p>
@@ -13637,14 +13702,14 @@
           <w:color w:val="1F2937"/>
           <w:sz w:val="19"/>
         </w:rPr>
-        <w:t xml:space="preserve">Recomendación Futura: </w:t>
+        <w:t xml:space="preserve">Trabajo Colaborativo: </w:t>
       </w:r>
       <w:r>
         <w:rPr>
           <w:color w:val="1F2937"/>
           <w:sz w:val="19"/>
         </w:rPr>
-        <w:t>Se recomienda extender en sprints posteriores la suite Cypress E2E a los módulos de Bolsillos y Tarjetas Virtuales.</w:t>
+        <w:t>El trabajo en equipo permitió abordar múltiples niveles de prueba con criterios uniformes y calidad homogénea.</w:t>
       </w:r>
     </w:p>
     <w:p>
@@ -13797,7 +13862,7 @@
                 <w:color w:val="FFFFFF"/>
                 <w:sz w:val="18"/>
               </w:rPr>
-              <w:t>Autor</w:t>
+              <w:t>Equipo de Autores</w:t>
             </w:r>
           </w:p>
         </w:tc>
@@ -13895,7 +13960,7 @@
                 <w:color w:val="1F2937"/>
                 <w:sz w:val="18"/>
               </w:rPr>
-              <w:t>Equipo FuBanking</w:t>
+              <w:t>Equipo de Testing FuBanking</w:t>
             </w:r>
           </w:p>
         </w:tc>
@@ -13969,7 +14034,7 @@
                 <w:color w:val="1F2937"/>
                 <w:sz w:val="18"/>
               </w:rPr>
-              <w:t>Documento completo auditado con evidencia de testing y diseño de marca</w:t>
+              <w:t>Documento completo auditado con evidencia de testing y diseño corporativo</w:t>
             </w:r>
           </w:p>
         </w:tc>
@@ -13993,7 +14058,7 @@
                 <w:color w:val="1F2937"/>
                 <w:sz w:val="18"/>
               </w:rPr>
-              <w:t>Andres Bedoya Cano</w:t>
+              <w:t>Equipo de Testing FuBanking</w:t>
             </w:r>
           </w:p>
         </w:tc>
@@ -14015,7 +14080,7 @@
           <w:color w:val="1E1B4B"/>
           <w:sz w:val="23"/>
         </w:rPr>
-        <w:t>20.2 Firmas de aprobación formal</w:t>
+        <w:t>20.2 Firmas de aprobación formal del equipo</w:t>
       </w:r>
     </w:p>
     <w:tbl>
@@ -14062,7 +14127,7 @@
                 <w:color w:val="FFFFFF"/>
                 <w:sz w:val="18"/>
               </w:rPr>
-              <w:t>Rol / Cargo</w:t>
+              <w:t>Rol / Función</w:t>
             </w:r>
           </w:p>
         </w:tc>
@@ -14166,7 +14231,7 @@
                 <w:color w:val="1F2937"/>
                 <w:sz w:val="18"/>
               </w:rPr>
-              <w:t>Líder de Testing (QA Lead)</w:t>
+              <w:t>Ingeniero de Calidad (Créditos)</w:t>
             </w:r>
           </w:p>
         </w:tc>
@@ -14264,7 +14329,7 @@
                 <w:color w:val="1F2937"/>
                 <w:sz w:val="18"/>
               </w:rPr>
-              <w:t>Ingeniero QA (Auth)</w:t>
+              <w:t>Ingeniero de Calidad (Auth)</w:t>
             </w:r>
           </w:p>
         </w:tc>
@@ -14362,7 +14427,7 @@
                 <w:color w:val="1F2937"/>
                 <w:sz w:val="18"/>
               </w:rPr>
-              <w:t>Ingeniero QA (Bolsillos)</w:t>
+              <w:t>Ingeniero de Calidad (Bolsillos)</w:t>
             </w:r>
           </w:p>
         </w:tc>
@@ -14460,7 +14525,7 @@
                 <w:color w:val="1F2937"/>
                 <w:sz w:val="18"/>
               </w:rPr>
-              <w:t>Ingeniero QA (Tarjetas)</w:t>
+              <w:t>Ingeniero de Calidad (Tarjetas)</w:t>
             </w:r>
           </w:p>
         </w:tc>
@@ -14755,7 +14820,6 @@
   <w:p>
     <w:pPr>
       <w:pStyle w:val="Header"/>
-      <w:pStyle w:val="Header"/>
     </w:pPr>
     <w:r/>
   </w:p>
@@ -14826,29 +14890,12 @@
               <w:color w:val="6B7280"/>
               <w:sz w:val="16"/>
             </w:rPr>
-            <w:t>Aseguramiento de Calidad QA</w:t>
+            <w:t>Confidencial · Uso Académico</w:t>
           </w:r>
         </w:p>
       </w:tc>
     </w:tr>
   </w:tbl>
-  <w:p>
-    <w:pPr>
-      <w:pStyle w:val="Header"/>
-    </w:pPr>
-    <w:r>
-      <w:pict>
-        <v:shapetype id="_x0000_t136" coordsize="21600,21600" o:spt="136" adj="10800" path="m@7,l@8,m@5,21600l@6,21600e">
-          <v:path textpathok="t" o:connecttype="rect"/>
-          <v:textpath on="t" fitshape="t"/>
-        </v:shapetype>
-        <v:shape id="PowerPlusWaterMarkObject" type="#_x0000_t136" style="position:absolute;margin-left:0;margin-top:0;width:520pt;height:90pt;rotation:-45;z-index:-251656704;mso-position-horizontal:center;mso-position-horizontal-relative:margin;mso-position-vertical:center;mso-position-vertical-relative:margin" fillcolor="#f3e8ff" stroked="f">
-          <v:fill opacity=".28"/>
-          <v:textpath style="font-family:'Arial';font-size:1pt;font-weight:bold" string="FUBANKING QA - USO ACADEMICO"/>
-        </v:shape>
-      </w:pict>
-    </w:r>
-  </w:p>
 </w:hdr>
 </file>
 

</xml_diff>